<commit_message>
docs: alinear los 4 documentos dirigidos con el protocolo de investigación/calidad
Reescritura de los escritos a Calidad, Jefatura/secciones, Dirección Médica e
Informática para que sean coherentes con el protocolo (mismo título de
proyecto, diseño antes-después, indicadores, conflicto de interés declarado,
medición de adopción sin telemetría y tramitación por CEIm).
</commit_message>
<xml_diff>
--- a/docs/01_HemoPocket_Comision_Calidad.docx
+++ b/docs/01_HemoPocket_Comision_Calidad.docx
@@ -26,7 +26,7 @@
           <w:color w:val="C41E3A"/>
           <w:sz w:val="29"/>
         </w:rPr>
-        <w:t>Propuesta de reconocimiento como herramienta de apoyo a la decisión clínica</w:t>
+        <w:t>Presentación de un proyecto de mejora de la calidad y solicitud de valoración</w:t>
       </w:r>
     </w:p>
     <w:tbl>
@@ -103,7 +103,7 @@
           <w:p>
             <w:r/>
             <w:r>
-              <w:t>Solicitud de valoración y reconocimiento de HemoPocket como herramienta de apoyo clínico del Servicio de Hematología</w:t>
+              <w:t>Valoración del proyecto "Implantación y evaluación de una herramienta de apoyo a la decisión clínica en Hematología"</w:t>
             </w:r>
           </w:p>
         </w:tc>
@@ -123,7 +123,7 @@
               <w:rPr>
                 <w:b/>
               </w:rPr>
-              <w:t>Promotora</w:t>
+              <w:t>Promotora / IP</w:t>
             </w:r>
           </w:p>
         </w:tc>
@@ -135,6 +135,37 @@
             <w:r/>
             <w:r>
               <w:t>Dra. María Teresa Busnego Barreto — F.E.A. Hematología y Hemoterapia</w:t>
+            </w:r>
+          </w:p>
+        </w:tc>
+      </w:tr>
+      <w:tr>
+        <w:tc>
+          <w:tcPr>
+            <w:tcW w:type="dxa" w:w="4680"/>
+          </w:tcPr>
+          <w:p>
+            <w:r>
+              <w:rPr>
+                <w:b/>
+              </w:rPr>
+            </w:r>
+            <w:r>
+              <w:rPr>
+                <w:b/>
+              </w:rPr>
+              <w:t>Documento adjunto</w:t>
+            </w:r>
+          </w:p>
+        </w:tc>
+        <w:tc>
+          <w:tcPr>
+            <w:tcW w:type="dxa" w:w="4680"/>
+          </w:tcPr>
+          <w:p>
+            <w:r/>
+            <w:r>
+              <w:t>Protocolo de Investigación y Mejora de la Calidad (estructura estándar)</w:t>
             </w:r>
           </w:p>
         </w:tc>
@@ -196,7 +227,16 @@
         <w:jc w:val="both"/>
       </w:pPr>
       <w:r>
-        <w:t xml:space="preserve">Tengo el placer de presentar a esta Comisión </w:t>
+        <w:t xml:space="preserve">Presento a esta Comisión el proyecto de mejora de la calidad </w:t>
+      </w:r>
+      <w:r>
+        <w:rPr>
+          <w:b/>
+        </w:rPr>
+        <w:t>«Implantación y evaluación de una herramienta de apoyo a la decisión clínica en Hematología»</w:t>
+      </w:r>
+      <w:r>
+        <w:t xml:space="preserve">, cuyo protocolo completo se adjunta. La herramienta evaluada es </w:t>
       </w:r>
       <w:r>
         <w:rPr>
@@ -205,16 +245,7 @@
         <w:t>HemoPocket</w:t>
       </w:r>
       <w:r>
-        <w:t xml:space="preserve">, una herramienta de apoyo a la decisión clínica desarrollada para el Servicio de Hematología y Hemoterapia, y de solicitar su valoración con vistas a su </w:t>
-      </w:r>
-      <w:r>
-        <w:rPr>
-          <w:b/>
-        </w:rPr>
-        <w:t>reconocimiento como recurso de apoyo del Servicio</w:t>
-      </w:r>
-      <w:r>
-        <w:t>. A continuación expongo su aportación específica a los objetivos de calidad y seguridad del paciente que son competencia de esta Comisión.</w:t>
+        <w:t>, una guía de consulta rápida desarrollada desde el propio Servicio. Solicito su valoración y, en su caso, el aval para su desarrollo y para su tramitación ante el comité correspondiente.</w:t>
       </w:r>
     </w:p>
     <w:p>
@@ -238,7 +269,7 @@
           <w:color w:val="C41E3A"/>
           <w:sz w:val="29"/>
         </w:rPr>
-        <w:t>1. Qué es, en una línea</w:t>
+        <w:t>1. El proyecto en una línea</w:t>
       </w:r>
     </w:p>
     <w:p>
@@ -246,16 +277,43 @@
         <w:jc w:val="both"/>
       </w:pPr>
       <w:r>
-        <w:t xml:space="preserve">Una guía de consulta rápida —disponible en móvil, tableta y ordenador, </w:t>
+        <w:t xml:space="preserve">Evaluar, mediante un </w:t>
       </w:r>
       <w:r>
         <w:rPr>
           <w:b/>
         </w:rPr>
-        <w:t>incluso sin conexión</w:t>
+        <w:t>estudio de intervención antes-después</w:t>
       </w:r>
       <w:r>
-        <w:t>— que reúne los algoritmos, escalas, calculadoras, criterios diagnósticos y guías clínicas de uso habitual en Hematología, en un único punto de acceso curado y actualizado.</w:t>
+        <w:t xml:space="preserve">, el impacto de implantar una herramienta de apoyo a la decisión clínica (HemoPocket) sobre la </w:t>
+      </w:r>
+      <w:r>
+        <w:rPr>
+          <w:b/>
+        </w:rPr>
+        <w:t>unificación de criterios</w:t>
+      </w:r>
+      <w:r>
+        <w:t xml:space="preserve">, la </w:t>
+      </w:r>
+      <w:r>
+        <w:rPr>
+          <w:b/>
+        </w:rPr>
+        <w:t>seguridad</w:t>
+      </w:r>
+      <w:r>
+        <w:t xml:space="preserve"> y la </w:t>
+      </w:r>
+      <w:r>
+        <w:rPr>
+          <w:b/>
+        </w:rPr>
+        <w:t>utilidad percibida</w:t>
+      </w:r>
+      <w:r>
+        <w:t xml:space="preserve"> en el Servicio de Hematología.</w:t>
       </w:r>
     </w:p>
     <w:p>
@@ -264,18 +322,10 @@
       </w:pPr>
       <w:r>
         <w:rPr>
-          <w:b/>
           <w:i/>
           <w:color w:val="666666"/>
         </w:rPr>
-        <w:t>No</w:t>
-      </w:r>
-      <w:r>
-        <w:rPr>
-          <w:i/>
-          <w:color w:val="666666"/>
-        </w:rPr>
-        <w:t xml:space="preserve"> es un dispositivo de diagnóstico ni de prescripción automática, y </w:t>
+        <w:t xml:space="preserve">La herramienta es un </w:t>
       </w:r>
       <w:r>
         <w:rPr>
@@ -283,14 +333,14 @@
           <w:i/>
           <w:color w:val="666666"/>
         </w:rPr>
-        <w:t>no</w:t>
+        <w:t>apoyo</w:t>
       </w:r>
       <w:r>
         <w:rPr>
           <w:i/>
           <w:color w:val="666666"/>
         </w:rPr>
-        <w:t xml:space="preserve"> almacena datos identificativos de pacientes. Es un apoyo que </w:t>
+        <w:t xml:space="preserve"> a la decisión: no es un dispositivo de diagnóstico ni de prescripción, </w:t>
       </w:r>
       <w:r>
         <w:rPr>
@@ -305,7 +355,22 @@
           <w:i/>
           <w:color w:val="666666"/>
         </w:rPr>
-        <w:t xml:space="preserve"> el juicio del facultativo ni los protocolos oficiales del centro.</w:t>
+        <w:t xml:space="preserve"> el juicio del facultativo ni los protocolos del centro, y </w:t>
+      </w:r>
+      <w:r>
+        <w:rPr>
+          <w:b/>
+          <w:i/>
+          <w:color w:val="666666"/>
+        </w:rPr>
+        <w:t>no trata datos identificativos de pacientes</w:t>
+      </w:r>
+      <w:r>
+        <w:rPr>
+          <w:i/>
+          <w:color w:val="666666"/>
+        </w:rPr>
+        <w:t>.</w:t>
       </w:r>
     </w:p>
     <w:p>
@@ -318,7 +383,7 @@
           <w:color w:val="C41E3A"/>
           <w:sz w:val="29"/>
         </w:rPr>
-        <w:t>2. Problema de calidad que resuelve</w:t>
+        <w:t>2. Problema de calidad y justificación</w:t>
       </w:r>
     </w:p>
     <w:p>
@@ -326,7 +391,7 @@
         <w:jc w:val="both"/>
       </w:pPr>
       <w:r>
-        <w:t xml:space="preserve">La información clínica en Hematología está habitualmente </w:t>
+        <w:t xml:space="preserve">La información clínica en Hematología está </w:t>
       </w:r>
       <w:r>
         <w:rPr>
@@ -335,58 +400,43 @@
         <w:t>fragmentada</w:t>
       </w:r>
       <w:r>
-        <w:t xml:space="preserve"> (PDF en carpetas de red, papel, calculadoras en webs externas) y </w:t>
+        <w:t xml:space="preserve"> y se </w:t>
       </w:r>
       <w:r>
         <w:rPr>
           <w:b/>
         </w:rPr>
-        <w:t>se desactualiza con rapidez</w:t>
+        <w:t>actualiza con rapidez</w:t>
       </w:r>
       <w:r>
-        <w:t xml:space="preserve"> (las clasificaciones y recomendaciones de ELN, ESMO, NCCN, SEHH, GELTAMO, PETHEMA, ISTH, IMWG… cambian con frecuencia). Esto genera:</w:t>
+        <w:t xml:space="preserve"> (ELN, ESMO, NCCN, SEHH, GELTAMO, PETHEMA, ISTH, IMWG…). Esto favorece la </w:t>
       </w:r>
-    </w:p>
-    <w:p>
-      <w:pPr>
-        <w:pStyle w:val="ListBullet"/>
-      </w:pPr>
       <w:r>
         <w:rPr>
           <w:b/>
         </w:rPr>
-        <w:t>Variabilidad no justificada</w:t>
+        <w:t>variabilidad no justificada</w:t>
       </w:r>
       <w:r>
-        <w:t xml:space="preserve"> entre facultativos y entre turnos.</w:t>
+        <w:t xml:space="preserve">, el uso de </w:t>
       </w:r>
-    </w:p>
-    <w:p>
-      <w:pPr>
-        <w:pStyle w:val="ListBullet"/>
-      </w:pPr>
       <w:r>
         <w:rPr>
           <w:b/>
         </w:rPr>
-        <w:t>Uso de versiones obsoletas</w:t>
+        <w:t>versiones desactualizadas</w:t>
       </w:r>
       <w:r>
-        <w:t xml:space="preserve"> de protocolos.</w:t>
+        <w:t xml:space="preserve"> y una elevada </w:t>
       </w:r>
-    </w:p>
-    <w:p>
-      <w:pPr>
-        <w:pStyle w:val="ListBullet"/>
-      </w:pPr>
       <w:r>
         <w:rPr>
           <w:b/>
         </w:rPr>
-        <w:t>Carga cognitiva y pérdida de tiempo</w:t>
+        <w:t>carga cognitiva</w:t>
       </w:r>
       <w:r>
-        <w:t xml:space="preserve"> en situaciones urgentes (neutropenia febril, microangiopatías, CRS/ICANS, reversión de anticoagulación, lisis tumoral…).</w:t>
+        <w:t xml:space="preserve"> en urgencias. El proyecto aborda directamente estos problemas, alineándose con los objetivos de seguridad del paciente y de reducción de la variabilidad.</w:t>
       </w:r>
     </w:p>
     <w:p>
@@ -399,7 +449,7 @@
           <w:color w:val="C41E3A"/>
           <w:sz w:val="29"/>
         </w:rPr>
-        <w:t>3. Aportación a la calidad y a la seguridad del paciente</w:t>
+        <w:t>3. Diseño y evaluación (resumen del protocolo)</w:t>
       </w:r>
     </w:p>
     <w:tbl>
@@ -428,7 +478,7 @@
               <w:rPr>
                 <w:b/>
               </w:rPr>
-              <w:t>Eje de calidad</w:t>
+              <w:t>Elemento</w:t>
             </w:r>
           </w:p>
         </w:tc>
@@ -446,7 +496,7 @@
               <w:rPr>
                 <w:b/>
               </w:rPr>
-              <w:t>Cómo lo aborda HemoPocket</w:t>
+              <w:t>Contenido</w:t>
             </w:r>
           </w:p>
         </w:tc>
@@ -462,7 +512,7 @@
               <w:rPr>
                 <w:b/>
               </w:rPr>
-              <w:t>Práctica basada en la evidencia</w:t>
+              <w:t>Diseño</w:t>
             </w:r>
           </w:p>
         </w:tc>
@@ -473,16 +523,7 @@
           <w:p>
             <w:r/>
             <w:r>
-              <w:t xml:space="preserve">Escalas y criterios reproducen guías de referencia, </w:t>
-            </w:r>
-            <w:r>
-              <w:rPr>
-                <w:b/>
-              </w:rPr>
-              <w:t>con cita bibliográfica</w:t>
-            </w:r>
-            <w:r>
-              <w:t>.</w:t>
+              <w:t>Estudio de intervención cuasi-experimental, antes-después, sin grupo control.</w:t>
             </w:r>
           </w:p>
         </w:tc>
@@ -498,7 +539,7 @@
               <w:rPr>
                 <w:b/>
               </w:rPr>
-              <w:t>Reducción de la variabilidad</w:t>
+              <w:t>Población</w:t>
             </w:r>
           </w:p>
         </w:tc>
@@ -509,7 +550,7 @@
           <w:p>
             <w:r/>
             <w:r>
-              <w:t>Un único origen de verdad para algoritmos, umbrales y criterios, común a todo el equipo.</w:t>
+              <w:t>Facultativos y residentes del Servicio (muestreo censal).</w:t>
             </w:r>
           </w:p>
         </w:tc>
@@ -525,7 +566,7 @@
               <w:rPr>
                 <w:b/>
               </w:rPr>
-              <w:t>Seguridad del paciente</w:t>
+              <w:t>Medición</w:t>
             </w:r>
           </w:p>
         </w:tc>
@@ -536,16 +577,7 @@
           <w:p>
             <w:r/>
             <w:r>
-              <w:t xml:space="preserve">Más de 50 calculadoras que minimizan errores de cálculo (dosis, aclaramiento, calcio corregido, conversión de opioides, QTc, lisis tumoral…) y </w:t>
-            </w:r>
-            <w:r>
-              <w:rPr>
-                <w:i/>
-              </w:rPr>
-              <w:t>check-lists</w:t>
-            </w:r>
-            <w:r>
-              <w:t xml:space="preserve"> de ingreso que reducen omisiones.</w:t>
+              <w:t>Cuestionario estructurado basal, a los 6 y a los 12 meses, más registro de adopción.</w:t>
             </w:r>
           </w:p>
         </w:tc>
@@ -561,7 +593,7 @@
               <w:rPr>
                 <w:b/>
               </w:rPr>
-              <w:t>Continuidad asistencial</w:t>
+              <w:t>Análisis</w:t>
             </w:r>
           </w:p>
         </w:tc>
@@ -572,88 +604,7 @@
           <w:p>
             <w:r/>
             <w:r>
-              <w:t>Misma información en todos los turnos y dispositivos; funciona sin conexión en cualquier punto del hospital.</w:t>
-            </w:r>
-          </w:p>
-        </w:tc>
-      </w:tr>
-      <w:tr>
-        <w:tc>
-          <w:tcPr>
-            <w:tcW w:type="dxa" w:w="4680"/>
-          </w:tcPr>
-          <w:p>
-            <w:r/>
-            <w:r>
-              <w:rPr>
-                <w:b/>
-              </w:rPr>
-              <w:t>Actualización continua</w:t>
-            </w:r>
-          </w:p>
-        </w:tc>
-        <w:tc>
-          <w:tcPr>
-            <w:tcW w:type="dxa" w:w="4680"/>
-          </w:tcPr>
-          <w:p>
-            <w:r/>
-            <w:r>
-              <w:t>El contenido se versiona y se distribuye de forma centralizada: al abrir la app con conexión, todos los equipos reciben la última versión.</w:t>
-            </w:r>
-          </w:p>
-        </w:tc>
-      </w:tr>
-      <w:tr>
-        <w:tc>
-          <w:tcPr>
-            <w:tcW w:type="dxa" w:w="4680"/>
-          </w:tcPr>
-          <w:p>
-            <w:r/>
-            <w:r>
-              <w:rPr>
-                <w:b/>
-              </w:rPr>
-              <w:t>Trazabilidad</w:t>
-            </w:r>
-          </w:p>
-        </w:tc>
-        <w:tc>
-          <w:tcPr>
-            <w:tcW w:type="dxa" w:w="4680"/>
-          </w:tcPr>
-          <w:p>
-            <w:r/>
-            <w:r>
-              <w:t>La app muestra la versión activa y la fecha de última sincronización; el historial de cambios queda registrado.</w:t>
-            </w:r>
-          </w:p>
-        </w:tc>
-      </w:tr>
-      <w:tr>
-        <w:tc>
-          <w:tcPr>
-            <w:tcW w:type="dxa" w:w="4680"/>
-          </w:tcPr>
-          <w:p>
-            <w:r/>
-            <w:r>
-              <w:rPr>
-                <w:b/>
-              </w:rPr>
-              <w:t>Docencia</w:t>
-            </w:r>
-          </w:p>
-        </w:tc>
-        <w:tc>
-          <w:tcPr>
-            <w:tcW w:type="dxa" w:w="4680"/>
-          </w:tcPr>
-          <w:p>
-            <w:r/>
-            <w:r>
-              <w:t>Recurso normalizado para residentes y formación continuada.</w:t>
+              <w:t>Descriptivo y bivariante pre-post (McNemar / Wilcoxon; p &lt; 0,05).</w:t>
             </w:r>
           </w:p>
         </w:tc>
@@ -670,7 +621,104 @@
           <w:color w:val="C41E3A"/>
           <w:sz w:val="29"/>
         </w:rPr>
-        <w:t>4. Garantías de calidad del contenido</w:t>
+        <w:t>4. Indicadores de calidad propuestos</w:t>
+      </w:r>
+    </w:p>
+    <w:p>
+      <w:pPr>
+        <w:pStyle w:val="ListNumber"/>
+      </w:pPr>
+      <w:r>
+        <w:rPr>
+          <w:b/>
+        </w:rPr>
+        <w:t>Grado de adopción</w:t>
+      </w:r>
+      <w:r>
+        <w:t>: cuentas activas y frecuencia de uso (sin telemetría; por privacidad, se mide por cuentas activas y autodeclaración).</w:t>
+      </w:r>
+    </w:p>
+    <w:p>
+      <w:pPr>
+        <w:pStyle w:val="ListNumber"/>
+      </w:pPr>
+      <w:r>
+        <w:rPr>
+          <w:b/>
+        </w:rPr>
+        <w:t>Unificación de criterios</w:t>
+      </w:r>
+      <w:r>
+        <w:t>: percepción de homogeneidad antes/después.</w:t>
+      </w:r>
+    </w:p>
+    <w:p>
+      <w:pPr>
+        <w:pStyle w:val="ListNumber"/>
+      </w:pPr>
+      <w:r>
+        <w:rPr>
+          <w:b/>
+        </w:rPr>
+        <w:t>Seguridad</w:t>
+      </w:r>
+      <w:r>
+        <w:t>: contribución percibida a la prevención de errores de cálculo y omisiones.</w:t>
+      </w:r>
+    </w:p>
+    <w:p>
+      <w:pPr>
+        <w:pStyle w:val="ListNumber"/>
+      </w:pPr>
+      <w:r>
+        <w:rPr>
+          <w:b/>
+        </w:rPr>
+        <w:t>Eficiencia</w:t>
+      </w:r>
+      <w:r>
+        <w:t>: percepción de ahorro de tiempo en el punto de atención.</w:t>
+      </w:r>
+    </w:p>
+    <w:p>
+      <w:pPr>
+        <w:pStyle w:val="ListNumber"/>
+      </w:pPr>
+      <w:r>
+        <w:rPr>
+          <w:b/>
+        </w:rPr>
+        <w:t>Satisfacción / utilidad</w:t>
+      </w:r>
+      <w:r>
+        <w:t xml:space="preserve"> del profesional y utilidad docente.</w:t>
+      </w:r>
+    </w:p>
+    <w:p>
+      <w:pPr>
+        <w:pStyle w:val="ListNumber"/>
+      </w:pPr>
+      <w:r>
+        <w:rPr>
+          <w:b/>
+        </w:rPr>
+        <w:t>Incidencias</w:t>
+      </w:r>
+      <w:r>
+        <w:t xml:space="preserve"> de seguridad o de protección de datos (objetivo: 0).</w:t>
+      </w:r>
+    </w:p>
+    <w:p>
+      <w:pPr>
+        <w:spacing w:before="200" w:after="80"/>
+      </w:pPr>
+      <w:r>
+        <w:rPr>
+          <w:b/>
+          <w:color w:val="C41E3A"/>
+          <w:sz w:val="29"/>
+        </w:rPr>
+        <w:t>5. Garantías</w:t>
       </w:r>
     </w:p>
     <w:p>
@@ -684,16 +732,7 @@
         <w:t>Revisión clínica por pares</w:t>
       </w:r>
       <w:r>
-        <w:t xml:space="preserve">: los contenidos han sido revisados por </w:t>
-      </w:r>
-      <w:r>
-        <w:rPr>
-          <w:b/>
-        </w:rPr>
-        <w:t>facultativos del propio Servicio</w:t>
-      </w:r>
-      <w:r>
-        <w:t>, acreditados como revisores por área dentro de la herramienta.</w:t>
+        <w:t xml:space="preserve"> del propio Servicio (revisores por área).</w:t>
       </w:r>
     </w:p>
     <w:p>
@@ -707,7 +746,7 @@
         <w:t>Fuentes reconocidas</w:t>
       </w:r>
       <w:r>
-        <w:t>: ELN, ESMO, NCCN, SEHH, GELTAMO, PETHEMA, ISTH, ASTCT, IMWG, iwCLL, entre otras.</w:t>
+        <w:t xml:space="preserve"> y con cita bibliográfica.</w:t>
       </w:r>
     </w:p>
     <w:p>
@@ -721,98 +760,21 @@
         <w:t>Aviso Legal y de privacidad</w:t>
       </w:r>
       <w:r>
-        <w:t xml:space="preserve"> accesible desde la propia app, con limitación de responsabilidad y aceptación en el primer uso.</w:t>
+        <w:t xml:space="preserve"> integrados, con aceptación en el primer uso.</w:t>
       </w:r>
     </w:p>
     <w:p>
       <w:pPr>
-        <w:spacing w:before="200" w:after="80"/>
-      </w:pPr>
-      <w:r>
-        <w:rPr>
-          <w:b/>
-          <w:color w:val="C41E3A"/>
-          <w:sz w:val="29"/>
-        </w:rPr>
-        <w:t>5. Indicadores propuestos para el seguimiento</w:t>
-      </w:r>
-    </w:p>
-    <w:p>
-      <w:pPr>
-        <w:jc w:val="both"/>
-      </w:pPr>
-      <w:r>
-        <w:t>A acordar con esta Comisión:</w:t>
-      </w:r>
-    </w:p>
-    <w:p>
-      <w:pPr>
-        <w:pStyle w:val="ListNumber"/>
+        <w:pStyle w:val="ListBullet"/>
       </w:pPr>
       <w:r>
         <w:rPr>
           <w:b/>
         </w:rPr>
-        <w:t>Grado de adopción</w:t>
+        <w:t>Conflicto de interés declarado</w:t>
       </w:r>
       <w:r>
-        <w:t>: facultativos con acceso activo / plantilla del Servicio.</w:t>
-      </w:r>
-    </w:p>
-    <w:p>
-      <w:pPr>
-        <w:pStyle w:val="ListNumber"/>
-      </w:pPr>
-      <w:r>
-        <w:rPr>
-          <w:b/>
-        </w:rPr>
-        <w:t>Actualización</w:t>
-      </w:r>
-      <w:r>
-        <w:t>: nº de actualizaciones por trimestre y tiempo medio de actualización tras la publicación de una nueva guía.</w:t>
-      </w:r>
-    </w:p>
-    <w:p>
-      <w:pPr>
-        <w:pStyle w:val="ListNumber"/>
-      </w:pPr>
-      <w:r>
-        <w:rPr>
-          <w:b/>
-        </w:rPr>
-        <w:t>Cobertura de revisión</w:t>
-      </w:r>
-      <w:r>
-        <w:t>: nº de áreas con revisor clínico asignado y contenido revisado.</w:t>
-      </w:r>
-    </w:p>
-    <w:p>
-      <w:pPr>
-        <w:pStyle w:val="ListNumber"/>
-      </w:pPr>
-      <w:r>
-        <w:rPr>
-          <w:b/>
-        </w:rPr>
-        <w:t>Satisfacción/utilidad percibida</w:t>
-      </w:r>
-      <w:r>
-        <w:t xml:space="preserve"> (encuesta semestral al equipo).</w:t>
-      </w:r>
-    </w:p>
-    <w:p>
-      <w:pPr>
-        <w:pStyle w:val="ListNumber"/>
-      </w:pPr>
-      <w:r>
-        <w:rPr>
-          <w:b/>
-        </w:rPr>
-        <w:t>Incidencias de seguridad o de protección de datos</w:t>
-      </w:r>
-      <w:r>
-        <w:t xml:space="preserve"> (objetivo: 0).</w:t>
+        <w:t>: la IP es la autora de la herramienta; se mitiga delegando la recogida y el análisis de los cuestionarios en un coinvestigador no autor.</w:t>
       </w:r>
     </w:p>
     <w:p>
@@ -836,10 +798,10 @@
         <w:rPr>
           <w:b/>
         </w:rPr>
-        <w:t>Valorar y, en su caso, reconocer</w:t>
+        <w:t>Valorar y avalar</w:t>
       </w:r>
       <w:r>
-        <w:t xml:space="preserve"> HemoPocket como herramienta de apoyo del Servicio de Hematología.</w:t>
+        <w:t xml:space="preserve"> el proyecto y su protocolo como iniciativa de mejora de la calidad del Servicio.</w:t>
       </w:r>
     </w:p>
     <w:p>
@@ -853,7 +815,7 @@
         <w:t>Acordar el cuadro de indicadores</w:t>
       </w:r>
       <w:r>
-        <w:t xml:space="preserve"> de seguimiento y la periodicidad de revisión (p. ej., anual).</w:t>
+        <w:t xml:space="preserve"> y la periodicidad de revisión.</w:t>
       </w:r>
     </w:p>
     <w:p>
@@ -864,10 +826,10 @@
         <w:rPr>
           <w:b/>
         </w:rPr>
-        <w:t>Avalar el modelo de gobernanza del contenido</w:t>
+        <w:t>Apoyar su tramitación</w:t>
       </w:r>
       <w:r>
-        <w:t xml:space="preserve"> (comité editorial del Servicio y procedimiento de actualización documentado).</w:t>
+        <w:t xml:space="preserve"> ante el CEIm y la interlocución con Sistemas de Información y con el Delegado de Protección de Datos.</w:t>
       </w:r>
     </w:p>
     <w:p>
@@ -875,7 +837,7 @@
         <w:jc w:val="both"/>
       </w:pPr>
       <w:r>
-        <w:t>Quedo a disposición de la Comisión para una demostración de la herramienta y para aportar cuanta documentación complementaria se precise (memoria completa del proyecto y documento técnico para Sistemas de Información).</w:t>
+        <w:t>Quedo a disposición de la Comisión para presentar el protocolo, realizar una demostración de la herramienta y aportar la documentación complementaria (memoria del proyecto y documento técnico).</w:t>
       </w:r>
     </w:p>
     <w:p>

</xml_diff>